<commit_message>
Explain contextual AI review results in the concise SATD report
</commit_message>
<xml_diff>
--- a/SATD_keywords_and_sensitivity.docx
+++ b/SATD_keywords_and_sensitivity.docx
@@ -1691,6 +1691,640 @@
         <w:t>Strict candidates account for 92.50% of the full candidate pool. This measures candidate coverage, not SATD recall. The keywords remain proposed: candidate counts do not establish confirmed debt, and manual validation is needed to estimate precision. These results use new pinned snapshots and do not reproduce the unavailable pilot.</w:t>
       </w:r>
     </w:p>
+    <w:p>
+      <w:r>
+        <w:br w:type="page"/>
+      </w:r>
+    </w:p>
+    <w:p>
+      <w:pPr>
+        <w:pStyle w:val="Heading1"/>
+      </w:pPr>
+      <w:r>
+        <w:t>Contextual review of two repositories</w:t>
+      </w:r>
+    </w:p>
+    <w:p>
+      <w:r>
+        <w:t>AI-assisted assessment of LangChain and LlamaIndex</w:t>
+      </w:r>
+    </w:p>
+    <w:p>
+      <w:r>
+        <w:t>Each sampled comment was read with its source-code context and assigned SATD, non-SATD or uncertain, with a written reason. Expanded context was inspected for ambiguous cases. SATD required an acknowledgement of an existing compromise, deficiency, shortcut or deferred corrective work. These are Codex judgments, not independent human labels.</w:t>
+      </w:r>
+    </w:p>
+    <w:p>
+      <w:pPr>
+        <w:pStyle w:val="Heading1"/>
+      </w:pPr>
+      <w:r>
+        <w:t>Review results</w:t>
+      </w:r>
+    </w:p>
+    <w:tbl>
+      <w:tblPr>
+        <w:tblW w:type="auto" w:w="0"/>
+        <w:tblLayout w:type="fixed"/>
+        <w:tblLook w:firstColumn="1" w:firstRow="1" w:lastColumn="0" w:lastRow="0" w:noHBand="0" w:noVBand="1" w:val="04A0"/>
+        <w:tblBorders>
+          <w:top w:val="single" w:sz="4" w:color="D9D9D9"/>
+          <w:left w:val="single" w:sz="4" w:color="D9D9D9"/>
+          <w:bottom w:val="single" w:sz="4" w:color="D9D9D9"/>
+          <w:right w:val="single" w:sz="4" w:color="D9D9D9"/>
+          <w:insideH w:val="single" w:sz="4" w:color="D9D9D9"/>
+          <w:insideV w:val="single" w:sz="4" w:color="D9D9D9"/>
+        </w:tblBorders>
+      </w:tblPr>
+      <w:tblGrid>
+        <w:gridCol w:w="3168"/>
+        <w:gridCol w:w="1728"/>
+        <w:gridCol w:w="1584"/>
+        <w:gridCol w:w="1944"/>
+        <w:gridCol w:w="1944"/>
+      </w:tblGrid>
+      <w:tr>
+        <w:trPr>
+          <w:tblHeader/>
+          <w:cantSplit/>
+        </w:trPr>
+        <w:tc>
+          <w:tcPr>
+            <w:tcW w:type="dxa" w:w="3168"/>
+            <w:vAlign w:val="center"/>
+            <w:tcMar>
+              <w:top w:w="85" w:type="dxa"/>
+              <w:bottom w:w="85" w:type="dxa"/>
+              <w:left w:w="85" w:type="dxa"/>
+              <w:right w:w="85" w:type="dxa"/>
+            </w:tcMar>
+            <w:shd w:fill="E8EEF4"/>
+          </w:tcPr>
+          <w:p>
+            <w:pPr>
+              <w:spacing w:after="0"/>
+              <w:jc w:val="left"/>
+            </w:pPr>
+            <w:r>
+              <w:rPr>
+                <w:b/>
+                <w:sz w:val="20"/>
+              </w:rPr>
+              <w:t>Repository</w:t>
+            </w:r>
+          </w:p>
+        </w:tc>
+        <w:tc>
+          <w:tcPr>
+            <w:tcW w:type="dxa" w:w="1728"/>
+            <w:vAlign w:val="center"/>
+            <w:tcMar>
+              <w:top w:w="85" w:type="dxa"/>
+              <w:bottom w:w="85" w:type="dxa"/>
+              <w:left w:w="85" w:type="dxa"/>
+              <w:right w:w="85" w:type="dxa"/>
+            </w:tcMar>
+            <w:shd w:fill="E8EEF4"/>
+          </w:tcPr>
+          <w:p>
+            <w:pPr>
+              <w:spacing w:after="0"/>
+              <w:jc w:val="center"/>
+            </w:pPr>
+            <w:r>
+              <w:rPr>
+                <w:b/>
+                <w:sz w:val="20"/>
+              </w:rPr>
+              <w:t>Reviewed</w:t>
+            </w:r>
+          </w:p>
+        </w:tc>
+        <w:tc>
+          <w:tcPr>
+            <w:tcW w:type="dxa" w:w="1584"/>
+            <w:vAlign w:val="center"/>
+            <w:tcMar>
+              <w:top w:w="85" w:type="dxa"/>
+              <w:bottom w:w="85" w:type="dxa"/>
+              <w:left w:w="85" w:type="dxa"/>
+              <w:right w:w="85" w:type="dxa"/>
+            </w:tcMar>
+            <w:shd w:fill="E8EEF4"/>
+          </w:tcPr>
+          <w:p>
+            <w:pPr>
+              <w:spacing w:after="0"/>
+              <w:jc w:val="center"/>
+            </w:pPr>
+            <w:r>
+              <w:rPr>
+                <w:b/>
+                <w:sz w:val="20"/>
+              </w:rPr>
+              <w:t>SATD</w:t>
+            </w:r>
+          </w:p>
+        </w:tc>
+        <w:tc>
+          <w:tcPr>
+            <w:tcW w:type="dxa" w:w="1944"/>
+            <w:vAlign w:val="center"/>
+            <w:tcMar>
+              <w:top w:w="85" w:type="dxa"/>
+              <w:bottom w:w="85" w:type="dxa"/>
+              <w:left w:w="85" w:type="dxa"/>
+              <w:right w:w="85" w:type="dxa"/>
+            </w:tcMar>
+            <w:shd w:fill="E8EEF4"/>
+          </w:tcPr>
+          <w:p>
+            <w:pPr>
+              <w:spacing w:after="0"/>
+              <w:jc w:val="center"/>
+            </w:pPr>
+            <w:r>
+              <w:rPr>
+                <w:b/>
+                <w:sz w:val="20"/>
+              </w:rPr>
+              <w:t>Non-SATD</w:t>
+            </w:r>
+          </w:p>
+        </w:tc>
+        <w:tc>
+          <w:tcPr>
+            <w:tcW w:type="dxa" w:w="1944"/>
+            <w:vAlign w:val="center"/>
+            <w:tcMar>
+              <w:top w:w="85" w:type="dxa"/>
+              <w:bottom w:w="85" w:type="dxa"/>
+              <w:left w:w="85" w:type="dxa"/>
+              <w:right w:w="85" w:type="dxa"/>
+            </w:tcMar>
+            <w:shd w:fill="E8EEF4"/>
+          </w:tcPr>
+          <w:p>
+            <w:pPr>
+              <w:spacing w:after="0"/>
+              <w:jc w:val="center"/>
+            </w:pPr>
+            <w:r>
+              <w:rPr>
+                <w:b/>
+                <w:sz w:val="20"/>
+              </w:rPr>
+              <w:t>Uncertain</w:t>
+            </w:r>
+          </w:p>
+        </w:tc>
+      </w:tr>
+      <w:tr>
+        <w:trPr>
+          <w:cantSplit/>
+        </w:trPr>
+        <w:tc>
+          <w:tcPr>
+            <w:tcW w:type="dxa" w:w="3168"/>
+            <w:vAlign w:val="center"/>
+            <w:tcMar>
+              <w:top w:w="85" w:type="dxa"/>
+              <w:bottom w:w="85" w:type="dxa"/>
+              <w:left w:w="85" w:type="dxa"/>
+              <w:right w:w="85" w:type="dxa"/>
+            </w:tcMar>
+          </w:tcPr>
+          <w:p>
+            <w:pPr>
+              <w:spacing w:after="0"/>
+              <w:jc w:val="left"/>
+            </w:pPr>
+            <w:r>
+              <w:rPr>
+                <w:b w:val="0"/>
+                <w:sz w:val="20"/>
+              </w:rPr>
+              <w:t>LangChain</w:t>
+            </w:r>
+          </w:p>
+        </w:tc>
+        <w:tc>
+          <w:tcPr>
+            <w:tcW w:type="dxa" w:w="1728"/>
+            <w:vAlign w:val="center"/>
+            <w:tcMar>
+              <w:top w:w="85" w:type="dxa"/>
+              <w:bottom w:w="85" w:type="dxa"/>
+              <w:left w:w="85" w:type="dxa"/>
+              <w:right w:w="85" w:type="dxa"/>
+            </w:tcMar>
+          </w:tcPr>
+          <w:p>
+            <w:pPr>
+              <w:spacing w:after="0"/>
+              <w:jc w:val="center"/>
+            </w:pPr>
+            <w:r>
+              <w:rPr>
+                <w:b w:val="0"/>
+                <w:sz w:val="20"/>
+              </w:rPr>
+              <w:t>27</w:t>
+            </w:r>
+          </w:p>
+        </w:tc>
+        <w:tc>
+          <w:tcPr>
+            <w:tcW w:type="dxa" w:w="1584"/>
+            <w:vAlign w:val="center"/>
+            <w:tcMar>
+              <w:top w:w="85" w:type="dxa"/>
+              <w:bottom w:w="85" w:type="dxa"/>
+              <w:left w:w="85" w:type="dxa"/>
+              <w:right w:w="85" w:type="dxa"/>
+            </w:tcMar>
+          </w:tcPr>
+          <w:p>
+            <w:pPr>
+              <w:spacing w:after="0"/>
+              <w:jc w:val="center"/>
+            </w:pPr>
+            <w:r>
+              <w:rPr>
+                <w:b w:val="0"/>
+                <w:sz w:val="20"/>
+              </w:rPr>
+              <w:t>17</w:t>
+            </w:r>
+          </w:p>
+        </w:tc>
+        <w:tc>
+          <w:tcPr>
+            <w:tcW w:type="dxa" w:w="1944"/>
+            <w:vAlign w:val="center"/>
+            <w:tcMar>
+              <w:top w:w="85" w:type="dxa"/>
+              <w:bottom w:w="85" w:type="dxa"/>
+              <w:left w:w="85" w:type="dxa"/>
+              <w:right w:w="85" w:type="dxa"/>
+            </w:tcMar>
+          </w:tcPr>
+          <w:p>
+            <w:pPr>
+              <w:spacing w:after="0"/>
+              <w:jc w:val="center"/>
+            </w:pPr>
+            <w:r>
+              <w:rPr>
+                <w:b w:val="0"/>
+                <w:sz w:val="20"/>
+              </w:rPr>
+              <w:t>9</w:t>
+            </w:r>
+          </w:p>
+        </w:tc>
+        <w:tc>
+          <w:tcPr>
+            <w:tcW w:type="dxa" w:w="1944"/>
+            <w:vAlign w:val="center"/>
+            <w:tcMar>
+              <w:top w:w="85" w:type="dxa"/>
+              <w:bottom w:w="85" w:type="dxa"/>
+              <w:left w:w="85" w:type="dxa"/>
+              <w:right w:w="85" w:type="dxa"/>
+            </w:tcMar>
+          </w:tcPr>
+          <w:p>
+            <w:pPr>
+              <w:spacing w:after="0"/>
+              <w:jc w:val="center"/>
+            </w:pPr>
+            <w:r>
+              <w:rPr>
+                <w:b w:val="0"/>
+                <w:sz w:val="20"/>
+              </w:rPr>
+              <w:t>1</w:t>
+            </w:r>
+          </w:p>
+        </w:tc>
+      </w:tr>
+      <w:tr>
+        <w:trPr>
+          <w:cantSplit/>
+        </w:trPr>
+        <w:tc>
+          <w:tcPr>
+            <w:tcW w:type="dxa" w:w="3168"/>
+            <w:vAlign w:val="center"/>
+            <w:tcMar>
+              <w:top w:w="85" w:type="dxa"/>
+              <w:bottom w:w="85" w:type="dxa"/>
+              <w:left w:w="85" w:type="dxa"/>
+              <w:right w:w="85" w:type="dxa"/>
+            </w:tcMar>
+          </w:tcPr>
+          <w:p>
+            <w:pPr>
+              <w:spacing w:after="0"/>
+              <w:jc w:val="left"/>
+            </w:pPr>
+            <w:r>
+              <w:rPr>
+                <w:b w:val="0"/>
+                <w:sz w:val="20"/>
+              </w:rPr>
+              <w:t>LlamaIndex</w:t>
+            </w:r>
+          </w:p>
+        </w:tc>
+        <w:tc>
+          <w:tcPr>
+            <w:tcW w:type="dxa" w:w="1728"/>
+            <w:vAlign w:val="center"/>
+            <w:tcMar>
+              <w:top w:w="85" w:type="dxa"/>
+              <w:bottom w:w="85" w:type="dxa"/>
+              <w:left w:w="85" w:type="dxa"/>
+              <w:right w:w="85" w:type="dxa"/>
+            </w:tcMar>
+          </w:tcPr>
+          <w:p>
+            <w:pPr>
+              <w:spacing w:after="0"/>
+              <w:jc w:val="center"/>
+            </w:pPr>
+            <w:r>
+              <w:rPr>
+                <w:b w:val="0"/>
+                <w:sz w:val="20"/>
+              </w:rPr>
+              <w:t>30</w:t>
+            </w:r>
+          </w:p>
+        </w:tc>
+        <w:tc>
+          <w:tcPr>
+            <w:tcW w:type="dxa" w:w="1584"/>
+            <w:vAlign w:val="center"/>
+            <w:tcMar>
+              <w:top w:w="85" w:type="dxa"/>
+              <w:bottom w:w="85" w:type="dxa"/>
+              <w:left w:w="85" w:type="dxa"/>
+              <w:right w:w="85" w:type="dxa"/>
+            </w:tcMar>
+          </w:tcPr>
+          <w:p>
+            <w:pPr>
+              <w:spacing w:after="0"/>
+              <w:jc w:val="center"/>
+            </w:pPr>
+            <w:r>
+              <w:rPr>
+                <w:b w:val="0"/>
+                <w:sz w:val="20"/>
+              </w:rPr>
+              <w:t>13</w:t>
+            </w:r>
+          </w:p>
+        </w:tc>
+        <w:tc>
+          <w:tcPr>
+            <w:tcW w:type="dxa" w:w="1944"/>
+            <w:vAlign w:val="center"/>
+            <w:tcMar>
+              <w:top w:w="85" w:type="dxa"/>
+              <w:bottom w:w="85" w:type="dxa"/>
+              <w:left w:w="85" w:type="dxa"/>
+              <w:right w:w="85" w:type="dxa"/>
+            </w:tcMar>
+          </w:tcPr>
+          <w:p>
+            <w:pPr>
+              <w:spacing w:after="0"/>
+              <w:jc w:val="center"/>
+            </w:pPr>
+            <w:r>
+              <w:rPr>
+                <w:b w:val="0"/>
+                <w:sz w:val="20"/>
+              </w:rPr>
+              <w:t>6</w:t>
+            </w:r>
+          </w:p>
+        </w:tc>
+        <w:tc>
+          <w:tcPr>
+            <w:tcW w:type="dxa" w:w="1944"/>
+            <w:vAlign w:val="center"/>
+            <w:tcMar>
+              <w:top w:w="85" w:type="dxa"/>
+              <w:bottom w:w="85" w:type="dxa"/>
+              <w:left w:w="85" w:type="dxa"/>
+              <w:right w:w="85" w:type="dxa"/>
+            </w:tcMar>
+          </w:tcPr>
+          <w:p>
+            <w:pPr>
+              <w:spacing w:after="0"/>
+              <w:jc w:val="center"/>
+            </w:pPr>
+            <w:r>
+              <w:rPr>
+                <w:b w:val="0"/>
+                <w:sz w:val="20"/>
+              </w:rPr>
+              <w:t>11</w:t>
+            </w:r>
+          </w:p>
+        </w:tc>
+      </w:tr>
+      <w:tr>
+        <w:trPr>
+          <w:cantSplit/>
+        </w:trPr>
+        <w:tc>
+          <w:tcPr>
+            <w:tcW w:type="dxa" w:w="3168"/>
+            <w:vAlign w:val="center"/>
+            <w:tcMar>
+              <w:top w:w="85" w:type="dxa"/>
+              <w:bottom w:w="85" w:type="dxa"/>
+              <w:left w:w="85" w:type="dxa"/>
+              <w:right w:w="85" w:type="dxa"/>
+            </w:tcMar>
+          </w:tcPr>
+          <w:p>
+            <w:pPr>
+              <w:spacing w:after="0"/>
+              <w:jc w:val="left"/>
+            </w:pPr>
+            <w:r>
+              <w:rPr>
+                <w:b/>
+                <w:sz w:val="20"/>
+              </w:rPr>
+              <w:t>Total</w:t>
+            </w:r>
+          </w:p>
+        </w:tc>
+        <w:tc>
+          <w:tcPr>
+            <w:tcW w:type="dxa" w:w="1728"/>
+            <w:vAlign w:val="center"/>
+            <w:tcMar>
+              <w:top w:w="85" w:type="dxa"/>
+              <w:bottom w:w="85" w:type="dxa"/>
+              <w:left w:w="85" w:type="dxa"/>
+              <w:right w:w="85" w:type="dxa"/>
+            </w:tcMar>
+          </w:tcPr>
+          <w:p>
+            <w:pPr>
+              <w:spacing w:after="0"/>
+              <w:jc w:val="center"/>
+            </w:pPr>
+            <w:r>
+              <w:rPr>
+                <w:b/>
+                <w:sz w:val="20"/>
+              </w:rPr>
+              <w:t>57</w:t>
+            </w:r>
+          </w:p>
+        </w:tc>
+        <w:tc>
+          <w:tcPr>
+            <w:tcW w:type="dxa" w:w="1584"/>
+            <w:vAlign w:val="center"/>
+            <w:tcMar>
+              <w:top w:w="85" w:type="dxa"/>
+              <w:bottom w:w="85" w:type="dxa"/>
+              <w:left w:w="85" w:type="dxa"/>
+              <w:right w:w="85" w:type="dxa"/>
+            </w:tcMar>
+          </w:tcPr>
+          <w:p>
+            <w:pPr>
+              <w:spacing w:after="0"/>
+              <w:jc w:val="center"/>
+            </w:pPr>
+            <w:r>
+              <w:rPr>
+                <w:b/>
+                <w:sz w:val="20"/>
+              </w:rPr>
+              <w:t>30</w:t>
+            </w:r>
+          </w:p>
+        </w:tc>
+        <w:tc>
+          <w:tcPr>
+            <w:tcW w:type="dxa" w:w="1944"/>
+            <w:vAlign w:val="center"/>
+            <w:tcMar>
+              <w:top w:w="85" w:type="dxa"/>
+              <w:bottom w:w="85" w:type="dxa"/>
+              <w:left w:w="85" w:type="dxa"/>
+              <w:right w:w="85" w:type="dxa"/>
+            </w:tcMar>
+          </w:tcPr>
+          <w:p>
+            <w:pPr>
+              <w:spacing w:after="0"/>
+              <w:jc w:val="center"/>
+            </w:pPr>
+            <w:r>
+              <w:rPr>
+                <w:b/>
+                <w:sz w:val="20"/>
+              </w:rPr>
+              <w:t>15</w:t>
+            </w:r>
+          </w:p>
+        </w:tc>
+        <w:tc>
+          <w:tcPr>
+            <w:tcW w:type="dxa" w:w="1944"/>
+            <w:vAlign w:val="center"/>
+            <w:tcMar>
+              <w:top w:w="85" w:type="dxa"/>
+              <w:bottom w:w="85" w:type="dxa"/>
+              <w:left w:w="85" w:type="dxa"/>
+              <w:right w:w="85" w:type="dxa"/>
+            </w:tcMar>
+          </w:tcPr>
+          <w:p>
+            <w:pPr>
+              <w:spacing w:after="0"/>
+              <w:jc w:val="center"/>
+            </w:pPr>
+            <w:r>
+              <w:rPr>
+                <w:b/>
+                <w:sz w:val="20"/>
+              </w:rPr>
+              <w:t>12</w:t>
+            </w:r>
+          </w:p>
+        </w:tc>
+      </w:tr>
+    </w:tbl>
+    <w:p>
+      <w:pPr>
+        <w:spacing w:before="120"/>
+      </w:pPr>
+      <w:r>
+        <w:t>Scope: 57 comments from the existing seeded 100-comment review sample, not all 372 candidates in these two repositories. The ten-repository sensitivity counts remain unchanged.</w:t>
+      </w:r>
+    </w:p>
+    <w:p>
+      <w:pPr>
+        <w:pStyle w:val="Heading1"/>
+      </w:pPr>
+      <w:r>
+        <w:t>Implications for keyword selection</w:t>
+      </w:r>
+    </w:p>
+    <w:p>
+      <w:r>
+        <w:t>The review supports using keywords to find candidates for contextual assessment rather than treating every match as confirmed debt. Thirty comments received SATD labels, while 15 received non-SATD labels. For example, LangChain comments explicitly describing temporary async workarounds and a LlamaIndex comment admitting missing streaming-output validation were labelled SATD. A hard-coded response in a fake test model and hard-coded security allowlists were labelled non-SATD because they described intentional behavior without an admitted deficiency.</w:t>
+      </w:r>
+    </w:p>
+    <w:p>
+      <w:r>
+        <w:t>The 12 uncertain cases show why TODO alone is insufficient. Some request optional features; others may be stale or do not explain the remaining deficiency. LlamaIndex accounted for 11 uncertain cases, so its comments particularly need human adjudication. Uncertain cases should remain visible rather than being forced into either binary category.</w:t>
+      </w:r>
+    </w:p>
+    <w:p>
+      <w:pPr>
+        <w:pStyle w:val="Heading1"/>
+      </w:pPr>
+      <w:r>
+        <w:t>What can be claimed in the report</w:t>
+      </w:r>
+    </w:p>
+    <w:p>
+      <w:r>
+        <w:t>The study demonstrates that candidate counts are sensitive to keyword and anchoring choices, and the contextual AI assessment identifies both plausible debt admissions and false-positive matches. It does not establish human-validated detector precision. The original 100-comment sample deliberately oversampled loose-only candidates, and these 57 comments are a subset of that stratified sample; a simple 30/57 ratio is therefore not an overall precision estimate. Reviewing only flagged comments also cannot establish absolute recall.</w:t>
+      </w:r>
+    </w:p>
+    <w:p>
+      <w:r>
+        <w:t>Retain the current keyword configuration as provisional until human reviewers confirm labels and adjudicate uncertainty. No reviewer agreement or Cohen's kappa can be reported from a single AI assessment. If the patterns change after calibration, evaluate a fresh held-out sample before reporting validation results.</w:t>
+      </w:r>
+    </w:p>
+    <w:p>
+      <w:pPr>
+        <w:spacing w:before="120"/>
+      </w:pPr>
+      <w:r>
+        <w:rPr>
+          <w:sz w:val="20"/>
+        </w:rPr>
+        <w:t>Evidence: AI_review_LangChain_LlamaIndex.csv retains all 57 comment IDs, pinned source links, reviewed context, AI labels and reasons. The original human-review sheets remain blank.</w:t>
+      </w:r>
+    </w:p>
     <w:sectPr>
       <w:pgSz w:w="12240" w:h="15840"/>
       <w:pgMar w:top="864" w:right="936" w:bottom="864" w:left="936" w:header="720" w:footer="720" w:gutter="0"/>

</xml_diff>